<commit_message>
Sunjay agreement: measure base equity pre-Seed; bracket all major variables
Base 15% now measured on the pre-Seed fully-diluted cap (so the seed
dilutes him, ~12.75% post-seed) with no anti-dilution. All adjustable
terms bracketed: percentages, tranches, anniversaries, milestone size/cap,
outside date, thresholds, term, sustained-performance window.

Co-Authored-By: Claude Opus 5 <noreply@anthropic.com>
Claude-Session: https://claude.ai/code/session_019ajJRqKa1DUy4iKHJKPEi3
</commit_message>
<xml_diff>
--- a/cinderella/legal/Sunjay_Mathews_Partner_Agreement.docx
+++ b/cinderella/legal/Sunjay_Mathews_Partner_Agreement.docx
@@ -872,7 +872,7 @@
           <w:sz w:val="22"/>
           <w:szCs w:val="22"/>
         </w:rPr>
-        <w:t xml:space="preserve">2. Base Equity — 15%</w:t>
+        <w:t xml:space="preserve">2. Base Equity — [15]%</w:t>
       </w:r>
     </w:p>
     <w:p>
@@ -949,7 +949,7 @@
           <w:sz w:val="22"/>
           <w:szCs w:val="22"/>
         </w:rPr>
-        <w:t xml:space="preserve">fifteen percent (15%)</w:t>
+        <w:t xml:space="preserve">[fifteen percent (15%)]</w:t>
       </w:r>
       <w:r>
         <w:rPr>
@@ -985,31 +985,55 @@
           <w:sz w:val="22"/>
           <w:szCs w:val="22"/>
         </w:rPr>
-        <w:t xml:space="preserve">"), measured on a </w:t>
-      </w:r>
-      <w:r>
-        <w:rPr>
-          <w:rFonts w:ascii="Times New Roman" w:cs="Times New Roman" w:eastAsia="Times New Roman" w:hAnsi="Times New Roman"/>
-          <w:b/>
-          <w:bCs/>
-          <w:i w:val="false"/>
-          <w:iCs w:val="false"/>
-          <w:sz w:val="22"/>
-          <w:szCs w:val="22"/>
-        </w:rPr>
-        <w:t xml:space="preserve">[fully-diluted basis immediately following the completion of the Seed Round — confirm measurement point]</w:t>
-      </w:r>
-      <w:r>
-        <w:rPr>
-          <w:rFonts w:ascii="Times New Roman" w:cs="Times New Roman" w:eastAsia="Times New Roman" w:hAnsi="Times New Roman"/>
-          <w:b w:val="false"/>
-          <w:bCs w:val="false"/>
-          <w:i w:val="false"/>
-          <w:iCs w:val="false"/>
-          <w:sz w:val="22"/>
-          <w:szCs w:val="22"/>
-        </w:rPr>
-        <w:t xml:space="preserve">.</w:t>
+        <w:t xml:space="preserve">"), measured on the </w:t>
+      </w:r>
+      <w:r>
+        <w:rPr>
+          <w:rFonts w:ascii="Times New Roman" w:cs="Times New Roman" w:eastAsia="Times New Roman" w:hAnsi="Times New Roman"/>
+          <w:b/>
+          <w:bCs/>
+          <w:i w:val="false"/>
+          <w:iCs w:val="false"/>
+          <w:sz w:val="22"/>
+          <w:szCs w:val="22"/>
+        </w:rPr>
+        <w:t xml:space="preserve">fully-diluted capitalization of the Company immediately PRIOR to the Seed Round</w:t>
+      </w:r>
+      <w:r>
+        <w:rPr>
+          <w:rFonts w:ascii="Times New Roman" w:cs="Times New Roman" w:eastAsia="Times New Roman" w:hAnsi="Times New Roman"/>
+          <w:b w:val="false"/>
+          <w:bCs w:val="false"/>
+          <w:i w:val="false"/>
+          <w:iCs w:val="false"/>
+          <w:sz w:val="22"/>
+          <w:szCs w:val="22"/>
+        </w:rPr>
+        <w:t xml:space="preserve"> (i.e., </w:t>
+      </w:r>
+      <w:r>
+        <w:rPr>
+          <w:rFonts w:ascii="Times New Roman" w:cs="Times New Roman" w:eastAsia="Times New Roman" w:hAnsi="Times New Roman"/>
+          <w:b/>
+          <w:bCs/>
+          <w:i w:val="false"/>
+          <w:iCs w:val="false"/>
+          <w:sz w:val="22"/>
+          <w:szCs w:val="22"/>
+        </w:rPr>
+        <w:t xml:space="preserve">pre-money / pre-Seed</w:t>
+      </w:r>
+      <w:r>
+        <w:rPr>
+          <w:rFonts w:ascii="Times New Roman" w:cs="Times New Roman" w:eastAsia="Times New Roman" w:hAnsi="Times New Roman"/>
+          <w:b w:val="false"/>
+          <w:bCs w:val="false"/>
+          <w:i w:val="false"/>
+          <w:iCs w:val="false"/>
+          <w:sz w:val="22"/>
+          <w:szCs w:val="22"/>
+        </w:rPr>
+        <w:t xml:space="preserve">).</w:t>
       </w:r>
     </w:p>
     <w:p>
@@ -1038,6 +1062,191 @@
           <w:sz w:val="22"/>
           <w:szCs w:val="22"/>
         </w:rPr>
+        <w:t xml:space="preserve">Seed dilution applies.</w:t>
+      </w:r>
+      <w:r>
+        <w:rPr>
+          <w:rFonts w:ascii="Times New Roman" w:cs="Times New Roman" w:eastAsia="Times New Roman" w:hAnsi="Times New Roman"/>
+          <w:b w:val="false"/>
+          <w:bCs w:val="false"/>
+          <w:i w:val="false"/>
+          <w:iCs w:val="false"/>
+          <w:sz w:val="22"/>
+          <w:szCs w:val="22"/>
+        </w:rPr>
+        <w:t xml:space="preserve"> Because the Base Shares are measured </w:t>
+      </w:r>
+      <w:r>
+        <w:rPr>
+          <w:rFonts w:ascii="Times New Roman" w:cs="Times New Roman" w:eastAsia="Times New Roman" w:hAnsi="Times New Roman"/>
+          <w:b/>
+          <w:bCs/>
+          <w:i w:val="false"/>
+          <w:iCs w:val="false"/>
+          <w:sz w:val="22"/>
+          <w:szCs w:val="22"/>
+        </w:rPr>
+        <w:t xml:space="preserve">pre-Seed</w:t>
+      </w:r>
+      <w:r>
+        <w:rPr>
+          <w:rFonts w:ascii="Times New Roman" w:cs="Times New Roman" w:eastAsia="Times New Roman" w:hAnsi="Times New Roman"/>
+          <w:b w:val="false"/>
+          <w:bCs w:val="false"/>
+          <w:i w:val="false"/>
+          <w:iCs w:val="false"/>
+          <w:sz w:val="22"/>
+          <w:szCs w:val="22"/>
+        </w:rPr>
+        <w:t xml:space="preserve">, Partner </w:t>
+      </w:r>
+      <w:r>
+        <w:rPr>
+          <w:rFonts w:ascii="Times New Roman" w:cs="Times New Roman" w:eastAsia="Times New Roman" w:hAnsi="Times New Roman"/>
+          <w:b/>
+          <w:bCs/>
+          <w:i w:val="false"/>
+          <w:iCs w:val="false"/>
+          <w:sz w:val="22"/>
+          <w:szCs w:val="22"/>
+        </w:rPr>
+        <w:t xml:space="preserve">is diluted by the Seed Round</w:t>
+      </w:r>
+      <w:r>
+        <w:rPr>
+          <w:rFonts w:ascii="Times New Roman" w:cs="Times New Roman" w:eastAsia="Times New Roman" w:hAnsi="Times New Roman"/>
+          <w:b w:val="false"/>
+          <w:bCs w:val="false"/>
+          <w:i w:val="false"/>
+          <w:iCs w:val="false"/>
+          <w:sz w:val="22"/>
+          <w:szCs w:val="22"/>
+        </w:rPr>
+        <w:t xml:space="preserve"> on the same basis as the Founders. For illustration only, a </w:t>
+      </w:r>
+      <w:r>
+        <w:rPr>
+          <w:rFonts w:ascii="Times New Roman" w:cs="Times New Roman" w:eastAsia="Times New Roman" w:hAnsi="Times New Roman"/>
+          <w:b/>
+          <w:bCs/>
+          <w:i w:val="false"/>
+          <w:iCs w:val="false"/>
+          <w:sz w:val="22"/>
+          <w:szCs w:val="22"/>
+        </w:rPr>
+        <w:t xml:space="preserve">[15]%</w:t>
+      </w:r>
+      <w:r>
+        <w:rPr>
+          <w:rFonts w:ascii="Times New Roman" w:cs="Times New Roman" w:eastAsia="Times New Roman" w:hAnsi="Times New Roman"/>
+          <w:b w:val="false"/>
+          <w:bCs w:val="false"/>
+          <w:i w:val="false"/>
+          <w:iCs w:val="false"/>
+          <w:sz w:val="22"/>
+          <w:szCs w:val="22"/>
+        </w:rPr>
+        <w:t xml:space="preserve"> pre-Seed position becomes approximately </w:t>
+      </w:r>
+      <w:r>
+        <w:rPr>
+          <w:rFonts w:ascii="Times New Roman" w:cs="Times New Roman" w:eastAsia="Times New Roman" w:hAnsi="Times New Roman"/>
+          <w:b/>
+          <w:bCs/>
+          <w:i w:val="false"/>
+          <w:iCs w:val="false"/>
+          <w:sz w:val="22"/>
+          <w:szCs w:val="22"/>
+        </w:rPr>
+        <w:t xml:space="preserve">[12.75]%</w:t>
+      </w:r>
+      <w:r>
+        <w:rPr>
+          <w:rFonts w:ascii="Times New Roman" w:cs="Times New Roman" w:eastAsia="Times New Roman" w:hAnsi="Times New Roman"/>
+          <w:b w:val="false"/>
+          <w:bCs w:val="false"/>
+          <w:i w:val="false"/>
+          <w:iCs w:val="false"/>
+          <w:sz w:val="22"/>
+          <w:szCs w:val="22"/>
+        </w:rPr>
+        <w:t xml:space="preserve"> following a </w:t>
+      </w:r>
+      <w:r>
+        <w:rPr>
+          <w:rFonts w:ascii="Times New Roman" w:cs="Times New Roman" w:eastAsia="Times New Roman" w:hAnsi="Times New Roman"/>
+          <w:b/>
+          <w:bCs/>
+          <w:i w:val="false"/>
+          <w:iCs w:val="false"/>
+          <w:sz w:val="22"/>
+          <w:szCs w:val="22"/>
+        </w:rPr>
+        <w:t xml:space="preserve">[15]%</w:t>
+      </w:r>
+      <w:r>
+        <w:rPr>
+          <w:rFonts w:ascii="Times New Roman" w:cs="Times New Roman" w:eastAsia="Times New Roman" w:hAnsi="Times New Roman"/>
+          <w:b w:val="false"/>
+          <w:bCs w:val="false"/>
+          <w:i w:val="false"/>
+          <w:iCs w:val="false"/>
+          <w:sz w:val="22"/>
+          <w:szCs w:val="22"/>
+        </w:rPr>
+        <w:t xml:space="preserve"> Seed Round. Partner has </w:t>
+      </w:r>
+      <w:r>
+        <w:rPr>
+          <w:rFonts w:ascii="Times New Roman" w:cs="Times New Roman" w:eastAsia="Times New Roman" w:hAnsi="Times New Roman"/>
+          <w:b/>
+          <w:bCs/>
+          <w:i w:val="false"/>
+          <w:iCs w:val="false"/>
+          <w:sz w:val="22"/>
+          <w:szCs w:val="22"/>
+        </w:rPr>
+        <w:t xml:space="preserve">no anti-dilution protection</w:t>
+      </w:r>
+      <w:r>
+        <w:rPr>
+          <w:rFonts w:ascii="Times New Roman" w:cs="Times New Roman" w:eastAsia="Times New Roman" w:hAnsi="Times New Roman"/>
+          <w:b w:val="false"/>
+          <w:bCs w:val="false"/>
+          <w:i w:val="false"/>
+          <w:iCs w:val="false"/>
+          <w:sz w:val="22"/>
+          <w:szCs w:val="22"/>
+        </w:rPr>
+        <w:t xml:space="preserve"> with respect to the Seed Round or any subsequent issuance.</w:t>
+      </w:r>
+    </w:p>
+    <w:p>
+      <w:pPr>
+        <w:spacing w:after="80"/>
+      </w:pPr>
+      <w:r>
+        <w:rPr>
+          <w:rFonts w:ascii="Times New Roman" w:cs="Times New Roman" w:eastAsia="Times New Roman" w:hAnsi="Times New Roman"/>
+          <w:b w:val="false"/>
+          <w:bCs w:val="false"/>
+          <w:i w:val="false"/>
+          <w:iCs w:val="false"/>
+          <w:sz w:val="22"/>
+          <w:szCs w:val="22"/>
+        </w:rPr>
+        <w:t xml:space="preserve">2.3 </w:t>
+      </w:r>
+      <w:r>
+        <w:rPr>
+          <w:rFonts w:ascii="Times New Roman" w:cs="Times New Roman" w:eastAsia="Times New Roman" w:hAnsi="Times New Roman"/>
+          <w:b/>
+          <w:bCs/>
+          <w:i w:val="false"/>
+          <w:iCs w:val="false"/>
+          <w:sz w:val="22"/>
+          <w:szCs w:val="22"/>
+        </w:rPr>
         <w:t xml:space="preserve">Vesting (cliff schedule).</w:t>
       </w:r>
       <w:r>
@@ -1050,7 +1259,7 @@
           <w:sz w:val="22"/>
           <w:szCs w:val="22"/>
         </w:rPr>
-        <w:t xml:space="preserve"> The Base Shares vest in three equal tranches:</w:t>
+        <w:t xml:space="preserve"> The Base Shares vest in three tranches:</w:t>
       </w:r>
     </w:p>
     <w:p>
@@ -1079,7 +1288,7 @@
           <w:sz w:val="22"/>
           <w:szCs w:val="22"/>
         </w:rPr>
-        <w:t xml:space="preserve">5%</w:t>
+        <w:t xml:space="preserve">[5]%</w:t>
       </w:r>
       <w:r>
         <w:rPr>
@@ -1144,7 +1353,7 @@
           <w:sz w:val="22"/>
           <w:szCs w:val="22"/>
         </w:rPr>
-        <w:t xml:space="preserve">5%</w:t>
+        <w:t xml:space="preserve">[5]%</w:t>
       </w:r>
       <w:r>
         <w:rPr>
@@ -1168,19 +1377,19 @@
           <w:sz w:val="22"/>
           <w:szCs w:val="22"/>
         </w:rPr>
-        <w:t xml:space="preserve">first anniversary</w:t>
-      </w:r>
-      <w:r>
-        <w:rPr>
-          <w:rFonts w:ascii="Times New Roman" w:cs="Times New Roman" w:eastAsia="Times New Roman" w:hAnsi="Times New Roman"/>
-          <w:b w:val="false"/>
-          <w:bCs w:val="false"/>
-          <w:i w:val="false"/>
-          <w:iCs w:val="false"/>
-          <w:sz w:val="22"/>
-          <w:szCs w:val="22"/>
-        </w:rPr>
-        <w:t xml:space="preserve"> of the Effective Date; and</w:t>
+        <w:t xml:space="preserve">[first]</w:t>
+      </w:r>
+      <w:r>
+        <w:rPr>
+          <w:rFonts w:ascii="Times New Roman" w:cs="Times New Roman" w:eastAsia="Times New Roman" w:hAnsi="Times New Roman"/>
+          <w:b w:val="false"/>
+          <w:bCs w:val="false"/>
+          <w:i w:val="false"/>
+          <w:iCs w:val="false"/>
+          <w:sz w:val="22"/>
+          <w:szCs w:val="22"/>
+        </w:rPr>
+        <w:t xml:space="preserve"> anniversary of the Effective Date; and</w:t>
       </w:r>
     </w:p>
     <w:p>
@@ -1209,7 +1418,7 @@
           <w:sz w:val="22"/>
           <w:szCs w:val="22"/>
         </w:rPr>
-        <w:t xml:space="preserve">5%</w:t>
+        <w:t xml:space="preserve">[5]%</w:t>
       </w:r>
       <w:r>
         <w:rPr>
@@ -1233,19 +1442,19 @@
           <w:sz w:val="22"/>
           <w:szCs w:val="22"/>
         </w:rPr>
-        <w:t xml:space="preserve">second anniversary</w:t>
-      </w:r>
-      <w:r>
-        <w:rPr>
-          <w:rFonts w:ascii="Times New Roman" w:cs="Times New Roman" w:eastAsia="Times New Roman" w:hAnsi="Times New Roman"/>
-          <w:b w:val="false"/>
-          <w:bCs w:val="false"/>
-          <w:i w:val="false"/>
-          <w:iCs w:val="false"/>
-          <w:sz w:val="22"/>
-          <w:szCs w:val="22"/>
-        </w:rPr>
-        <w:t xml:space="preserve"> of the Effective Date,</w:t>
+        <w:t xml:space="preserve">[second]</w:t>
+      </w:r>
+      <w:r>
+        <w:rPr>
+          <w:rFonts w:ascii="Times New Roman" w:cs="Times New Roman" w:eastAsia="Times New Roman" w:hAnsi="Times New Roman"/>
+          <w:b w:val="false"/>
+          <w:bCs w:val="false"/>
+          <w:i w:val="false"/>
+          <w:iCs w:val="false"/>
+          <w:sz w:val="22"/>
+          <w:szCs w:val="22"/>
+        </w:rPr>
+        <w:t xml:space="preserve"> anniversary of the Effective Date,</w:t>
       </w:r>
     </w:p>
     <w:p>
@@ -1322,24 +1531,24 @@
           <w:sz w:val="22"/>
           <w:szCs w:val="22"/>
         </w:rPr>
-        <w:t xml:space="preserve">[Confirm; monthly vesting after the initial 5% is the alternative if you want to reduce the all-or-nothing effect at each anniversary.]</w:t>
-      </w:r>
-    </w:p>
-    <w:p>
-      <w:pPr>
-        <w:spacing w:after="80"/>
-      </w:pPr>
-      <w:r>
-        <w:rPr>
-          <w:rFonts w:ascii="Times New Roman" w:cs="Times New Roman" w:eastAsia="Times New Roman" w:hAnsi="Times New Roman"/>
-          <w:b w:val="false"/>
-          <w:bCs w:val="false"/>
-          <w:i w:val="false"/>
-          <w:iCs w:val="false"/>
-          <w:sz w:val="22"/>
-          <w:szCs w:val="22"/>
-        </w:rPr>
-        <w:t xml:space="preserve">2.3 </w:t>
+        <w:t xml:space="preserve">[Confirm; monthly vesting after the initial tranche is the alternative if you want to soften the all-or-nothing effect at each anniversary.]</w:t>
+      </w:r>
+    </w:p>
+    <w:p>
+      <w:pPr>
+        <w:spacing w:after="80"/>
+      </w:pPr>
+      <w:r>
+        <w:rPr>
+          <w:rFonts w:ascii="Times New Roman" w:cs="Times New Roman" w:eastAsia="Times New Roman" w:hAnsi="Times New Roman"/>
+          <w:b w:val="false"/>
+          <w:bCs w:val="false"/>
+          <w:i w:val="false"/>
+          <w:iCs w:val="false"/>
+          <w:sz w:val="22"/>
+          <w:szCs w:val="22"/>
+        </w:rPr>
+        <w:t xml:space="preserve">2.4 </w:t>
       </w:r>
       <w:r>
         <w:rPr>
@@ -1404,7 +1613,7 @@
           <w:sz w:val="22"/>
           <w:szCs w:val="22"/>
         </w:rPr>
-        <w:t xml:space="preserve">2.4 </w:t>
+        <w:t xml:space="preserve">2.5 </w:t>
       </w:r>
       <w:r>
         <w:rPr>
@@ -1452,7 +1661,7 @@
           <w:sz w:val="22"/>
           <w:szCs w:val="22"/>
         </w:rPr>
-        <w:t xml:space="preserve"> on all issuances after the measurement point in Section 2.1. Partner has </w:t>
+        <w:t xml:space="preserve"> on all issuances. Partner has </w:t>
       </w:r>
       <w:r>
         <w:rPr>
@@ -1490,7 +1699,7 @@
           <w:sz w:val="22"/>
           <w:szCs w:val="22"/>
         </w:rPr>
-        <w:t xml:space="preserve">3. Milestone Equity — up to an additional 5% (to a 20% maximum)</w:t>
+        <w:t xml:space="preserve">3. Milestone Equity — up to an additional [5]% (to a [20]% maximum)</w:t>
       </w:r>
     </w:p>
     <w:p>
@@ -1543,7 +1752,7 @@
           <w:sz w:val="22"/>
           <w:szCs w:val="22"/>
         </w:rPr>
-        <w:t xml:space="preserve">an additional five percent (5%)</w:t>
+        <w:t xml:space="preserve">an additional [five percent (5%)]</w:t>
       </w:r>
       <w:r>
         <w:rPr>
@@ -1591,7 +1800,7 @@
           <w:sz w:val="22"/>
           <w:szCs w:val="22"/>
         </w:rPr>
-        <w:t xml:space="preserve">twenty percent (20%)</w:t>
+        <w:t xml:space="preserve">[twenty percent (20%)]</w:t>
       </w:r>
       <w:r>
         <w:rPr>
@@ -1651,7 +1860,43 @@
           <w:sz w:val="22"/>
           <w:szCs w:val="22"/>
         </w:rPr>
-        <w:t xml:space="preserve"> — completing both Tracks earns 5%, not 10%.</w:t>
+        <w:t xml:space="preserve"> — completing both Tracks earns </w:t>
+      </w:r>
+      <w:r>
+        <w:rPr>
+          <w:rFonts w:ascii="Times New Roman" w:cs="Times New Roman" w:eastAsia="Times New Roman" w:hAnsi="Times New Roman"/>
+          <w:b/>
+          <w:bCs/>
+          <w:i w:val="false"/>
+          <w:iCs w:val="false"/>
+          <w:sz w:val="22"/>
+          <w:szCs w:val="22"/>
+        </w:rPr>
+        <w:t xml:space="preserve">[5]%</w:t>
+      </w:r>
+      <w:r>
+        <w:rPr>
+          <w:rFonts w:ascii="Times New Roman" w:cs="Times New Roman" w:eastAsia="Times New Roman" w:hAnsi="Times New Roman"/>
+          <w:b w:val="false"/>
+          <w:bCs w:val="false"/>
+          <w:i w:val="false"/>
+          <w:iCs w:val="false"/>
+          <w:sz w:val="22"/>
+          <w:szCs w:val="22"/>
+        </w:rPr>
+        <w:t xml:space="preserve">, not [10]%. </w:t>
+      </w:r>
+      <w:r>
+        <w:rPr>
+          <w:rFonts w:ascii="Times New Roman" w:cs="Times New Roman" w:eastAsia="Times New Roman" w:hAnsi="Times New Roman"/>
+          <w:b/>
+          <w:bCs/>
+          <w:i w:val="false"/>
+          <w:iCs w:val="false"/>
+          <w:sz w:val="22"/>
+          <w:szCs w:val="22"/>
+        </w:rPr>
+        <w:t xml:space="preserve">[Confirm the measurement point for the Milestone Shares: fully diluted as of the achievement date (as drafted in 3.6), or pre-Seed like the Base Shares.]</w:t>
       </w:r>
     </w:p>
     <w:p>
@@ -2341,7 +2586,19 @@
           <w:sz w:val="22"/>
           <w:szCs w:val="22"/>
         </w:rPr>
-        <w:t xml:space="preserve">[three (3)] consecutive seasons.</w:t>
+        <w:t xml:space="preserve">[three (3)]</w:t>
+      </w:r>
+      <w:r>
+        <w:rPr>
+          <w:rFonts w:ascii="Times New Roman" w:cs="Times New Roman" w:eastAsia="Times New Roman" w:hAnsi="Times New Roman"/>
+          <w:b w:val="false"/>
+          <w:bCs w:val="false"/>
+          <w:i w:val="false"/>
+          <w:iCs w:val="false"/>
+          <w:sz w:val="22"/>
+          <w:szCs w:val="22"/>
+        </w:rPr>
+        <w:t xml:space="preserve"> consecutive seasons.</w:t>
       </w:r>
     </w:p>
     <w:p>
@@ -2661,7 +2918,7 @@
           <w:sz w:val="22"/>
           <w:szCs w:val="22"/>
         </w:rPr>
-        <w:t xml:space="preserve">twelve (12) months</w:t>
+        <w:t xml:space="preserve">[twelve (12)] months</w:t>
       </w:r>
       <w:r>
         <w:rPr>
@@ -3313,7 +3570,7 @@
           <w:sz w:val="22"/>
           <w:szCs w:val="22"/>
         </w:rPr>
-        <w:t xml:space="preserve">twelve (12) months</w:t>
+        <w:t xml:space="preserve">[twelve (12)] months</w:t>
       </w:r>
       <w:r>
         <w:rPr>

</xml_diff>